<commit_message>
Add systematic search strategy; document full-text/database access blocker
Adds ready-to-run Web of Science, Scopus, and PubMed search strings
(not executed - no database access available to this session). Updates
Evidence Freeze Audit with a retested, dated access-failure log rather
than fabricated hit counts or full-text-verification claims.
</commit_message>
<xml_diff>
--- a/wbe-review/WBE_Review_Ch8_Evidence_Freeze_Audit.docx
+++ b/wbe-review/WBE_Review_Ch8_Evidence_Freeze_Audit.docx
@@ -791,6 +791,132 @@
       </w:r>
       <w:r>
         <w:t xml:space="preserve">Every citation in this review — including the ones with the highest metadata confidence (e.g., [13] Rainey et al., [33] Chettleburgh et al., [48] Safford et al., all resolved via PubMed-indexed records or dedicated author-list searches) — is supported only by search-engine-summarized abstracts, snippets, or metadata records, never by the full text of the source itself. This is stated once here as a blanket fact rather than re-flagged per source, consistent with the main document’s practice, but is restated explicitly in this audit because it is the single most consequential limitation of the entire review to date.</w:t>
+      </w:r>
+    </w:p>
+    <w:p>
+      <w:pPr>
+        <w:pStyle w:val="BodyText"/>
+      </w:pPr>
+      <w:r>
+        <w:rPr>
+          <w:bCs/>
+          <w:b/>
+        </w:rPr>
+        <w:t xml:space="preserve">2026-07-13 retest and access-failure log.</w:t>
+      </w:r>
+      <w:r>
+        <w:t xml:space="preserve"> </w:t>
+      </w:r>
+      <w:r>
+        <w:t xml:space="preserve">Immediately before this revision, WebFetch was re-tested against two representative targets:</w:t>
+      </w:r>
+      <w:r>
+        <w:t xml:space="preserve"> </w:t>
+      </w:r>
+      <w:r>
+        <w:rPr>
+          <w:rStyle w:val="VerbatimChar"/>
+        </w:rPr>
+        <w:t xml:space="preserve">https://doi.org/10.1021/acsestwater.2c00053</w:t>
+      </w:r>
+      <w:r>
+        <w:t xml:space="preserve"> </w:t>
+      </w:r>
+      <w:r>
+        <w:t xml:space="preserve">([48] Safford et al.) and</w:t>
+      </w:r>
+      <w:r>
+        <w:t xml:space="preserve"> </w:t>
+      </w:r>
+      <w:r>
+        <w:rPr>
+          <w:rStyle w:val="VerbatimChar"/>
+        </w:rPr>
+        <w:t xml:space="preserve">https://pubmed.ncbi.nlm.nih.gov/37660819/</w:t>
+      </w:r>
+      <w:r>
+        <w:t xml:space="preserve"> </w:t>
+      </w:r>
+      <w:r>
+        <w:t xml:space="preserve">([33] Chettleburgh et al.). Both returned</w:t>
+      </w:r>
+      <w:r>
+        <w:t xml:space="preserve"> </w:t>
+      </w:r>
+      <w:r>
+        <w:rPr>
+          <w:bCs/>
+          <w:b/>
+        </w:rPr>
+        <w:t xml:space="preserve">HTTP 403 Forbidden</w:t>
+      </w:r>
+      <w:r>
+        <w:t xml:space="preserve">. This is the same failure mode documented at every prior full-text attempt across Chapters 1–8 — no publisher, PMC, DOI-resolver, or PubMed page has ever returned content to this session. A tool-registry search additionally confirmed</w:t>
+      </w:r>
+      <w:r>
+        <w:t xml:space="preserve"> </w:t>
+      </w:r>
+      <w:r>
+        <w:rPr>
+          <w:bCs/>
+          <w:b/>
+        </w:rPr>
+        <w:t xml:space="preserve">no Web of Science, Scopus, or other bibliographic-database connector is available to this session at all</w:t>
+      </w:r>
+      <w:r>
+        <w:t xml:space="preserve"> </w:t>
+      </w:r>
+      <w:r>
+        <w:t xml:space="preserve">(see</w:t>
+      </w:r>
+      <w:r>
+        <w:t xml:space="preserve"> </w:t>
+      </w:r>
+      <w:r>
+        <w:rPr>
+          <w:rStyle w:val="VerbatimChar"/>
+        </w:rPr>
+        <w:t xml:space="preserve">WBE_Review_Systematic_Search_Strategy.md</w:t>
+      </w:r>
+      <w:r>
+        <w:t xml:space="preserve"> </w:t>
+      </w:r>
+      <w:r>
+        <w:t xml:space="preserve">§6 for the full test record). Because the failure reason is identical and structural (a blocked outbound-fetch capability, not a per-source access-tier issue), it is logged once here rather than as 51 near-duplicate rows; the Citation Verification Table’s per-row</w:t>
+      </w:r>
+      <w:r>
+        <w:t xml:space="preserve"> </w:t>
+      </w:r>
+      <w:r>
+        <w:t xml:space="preserve">“</w:t>
+      </w:r>
+      <w:r>
+        <w:t xml:space="preserve">Claim status</w:t>
+      </w:r>
+      <w:r>
+        <w:t xml:space="preserve">”</w:t>
+      </w:r>
+      <w:r>
+        <w:t xml:space="preserve"> </w:t>
+      </w:r>
+      <w:r>
+        <w:t xml:space="preserve">column already records the resulting confidence downgrade for each individual reference.</w:t>
+      </w:r>
+      <w:r>
+        <w:t xml:space="preserve"> </w:t>
+      </w:r>
+      <w:r>
+        <w:rPr>
+          <w:bCs/>
+          <w:b/>
+        </w:rPr>
+        <w:t xml:space="preserve">Remediation requires one of:</w:t>
+      </w:r>
+      <w:r>
+        <w:t xml:space="preserve"> </w:t>
+      </w:r>
+      <w:r>
+        <w:t xml:space="preserve">(a) database/full-text access being granted to this session (not currently possible from within the session itself), or (b) the user supplying PDFs, exports, or pasted full text for specific papers, which this session can read and audit directly once provided. Until either occurs, the correct and honest state of this count is 0/51, not a higher number.</w:t>
       </w:r>
     </w:p>
     <w:bookmarkEnd w:id="21"/>

</xml_diff>